<commit_message>
Se realizo la fase 2, se creo la imagen en docker y se esta corriendo en el puerto 5000
</commit_message>
<xml_diff>
--- a/docs/Modificaciones.docx
+++ b/docs/Modificaciones.docx
@@ -31,6 +31,9 @@
         <w:ind w:left="3540" w:firstLine="708"/>
       </w:pPr>
       <w:r>
+        <w:rPr>
+          <w:noProof/>
+        </w:rPr>
         <w:lastRenderedPageBreak/>
         <w:drawing>
           <wp:anchor distT="0" distB="0" distL="114300" distR="114300" simplePos="0" relativeHeight="251658240" behindDoc="0" locked="0" layoutInCell="1" allowOverlap="1" wp14:anchorId="5785B2E6" wp14:editId="4649F3B4">
@@ -102,6 +105,145 @@
         <w:t>Este diseño esta muy plano y hay muchos espacios en blanco. Por esta razón se le va a cambiar a un diseño mas llamativo, en la parte de arriba se van a agregar 3 tarjetas</w:t>
       </w:r>
     </w:p>
+    <w:p>
+      <w:r>
+        <w:t>Demostración donde la aplicación esta corriendo en el puerto 5000</w:t>
+      </w:r>
+    </w:p>
+    <w:p>
+      <w:pPr>
+        <w:rPr>
+          <w:noProof/>
+        </w:rPr>
+      </w:pPr>
+      <w:r>
+        <w:rPr>
+          <w:noProof/>
+        </w:rPr>
+        <w:drawing>
+          <wp:inline distT="0" distB="0" distL="0" distR="0" wp14:anchorId="55215EE8" wp14:editId="5CCEBDEB">
+            <wp:extent cx="5612130" cy="560070"/>
+            <wp:effectExtent l="0" t="0" r="7620" b="0"/>
+            <wp:docPr id="2" name="Imagen 2"/>
+            <wp:cNvGraphicFramePr>
+              <a:graphicFrameLocks xmlns:a="http://schemas.openxmlformats.org/drawingml/2006/main" noChangeAspect="1"/>
+            </wp:cNvGraphicFramePr>
+            <a:graphic xmlns:a="http://schemas.openxmlformats.org/drawingml/2006/main">
+              <a:graphicData uri="http://schemas.openxmlformats.org/drawingml/2006/picture">
+                <pic:pic xmlns:pic="http://schemas.openxmlformats.org/drawingml/2006/picture">
+                  <pic:nvPicPr>
+                    <pic:cNvPr id="1" name=""/>
+                    <pic:cNvPicPr/>
+                  </pic:nvPicPr>
+                  <pic:blipFill>
+                    <a:blip r:embed="rId6"/>
+                    <a:stretch>
+                      <a:fillRect/>
+                    </a:stretch>
+                  </pic:blipFill>
+                  <pic:spPr>
+                    <a:xfrm>
+                      <a:off x="0" y="0"/>
+                      <a:ext cx="5612130" cy="560070"/>
+                    </a:xfrm>
+                    <a:prstGeom prst="rect">
+                      <a:avLst/>
+                    </a:prstGeom>
+                  </pic:spPr>
+                </pic:pic>
+              </a:graphicData>
+            </a:graphic>
+          </wp:inline>
+        </w:drawing>
+      </w:r>
+      <w:r>
+        <w:rPr>
+          <w:noProof/>
+        </w:rPr>
+        <w:t xml:space="preserve"> </w:t>
+      </w:r>
+      <w:r>
+        <w:rPr>
+          <w:noProof/>
+        </w:rPr>
+        <w:drawing>
+          <wp:inline distT="0" distB="0" distL="0" distR="0" wp14:anchorId="07E4D59D" wp14:editId="4E11BF30">
+            <wp:extent cx="5612130" cy="1362075"/>
+            <wp:effectExtent l="0" t="0" r="7620" b="9525"/>
+            <wp:docPr id="4" name="Imagen 4"/>
+            <wp:cNvGraphicFramePr>
+              <a:graphicFrameLocks xmlns:a="http://schemas.openxmlformats.org/drawingml/2006/main" noChangeAspect="1"/>
+            </wp:cNvGraphicFramePr>
+            <a:graphic xmlns:a="http://schemas.openxmlformats.org/drawingml/2006/main">
+              <a:graphicData uri="http://schemas.openxmlformats.org/drawingml/2006/picture">
+                <pic:pic xmlns:pic="http://schemas.openxmlformats.org/drawingml/2006/picture">
+                  <pic:nvPicPr>
+                    <pic:cNvPr id="1" name=""/>
+                    <pic:cNvPicPr/>
+                  </pic:nvPicPr>
+                  <pic:blipFill>
+                    <a:blip r:embed="rId7"/>
+                    <a:stretch>
+                      <a:fillRect/>
+                    </a:stretch>
+                  </pic:blipFill>
+                  <pic:spPr>
+                    <a:xfrm>
+                      <a:off x="0" y="0"/>
+                      <a:ext cx="5612130" cy="1362075"/>
+                    </a:xfrm>
+                    <a:prstGeom prst="rect">
+                      <a:avLst/>
+                    </a:prstGeom>
+                  </pic:spPr>
+                </pic:pic>
+              </a:graphicData>
+            </a:graphic>
+          </wp:inline>
+        </w:drawing>
+      </w:r>
+      <w:r>
+        <w:rPr>
+          <w:noProof/>
+        </w:rPr>
+        <w:drawing>
+          <wp:inline distT="0" distB="0" distL="0" distR="0" wp14:anchorId="201FE9D7" wp14:editId="41C87138">
+            <wp:extent cx="5612130" cy="2210435"/>
+            <wp:effectExtent l="0" t="0" r="7620" b="0"/>
+            <wp:docPr id="3" name="Imagen 3"/>
+            <wp:cNvGraphicFramePr>
+              <a:graphicFrameLocks xmlns:a="http://schemas.openxmlformats.org/drawingml/2006/main" noChangeAspect="1"/>
+            </wp:cNvGraphicFramePr>
+            <a:graphic xmlns:a="http://schemas.openxmlformats.org/drawingml/2006/main">
+              <a:graphicData uri="http://schemas.openxmlformats.org/drawingml/2006/picture">
+                <pic:pic xmlns:pic="http://schemas.openxmlformats.org/drawingml/2006/picture">
+                  <pic:nvPicPr>
+                    <pic:cNvPr id="1" name=""/>
+                    <pic:cNvPicPr/>
+                  </pic:nvPicPr>
+                  <pic:blipFill>
+                    <a:blip r:embed="rId8"/>
+                    <a:stretch>
+                      <a:fillRect/>
+                    </a:stretch>
+                  </pic:blipFill>
+                  <pic:spPr>
+                    <a:xfrm>
+                      <a:off x="0" y="0"/>
+                      <a:ext cx="5612130" cy="2210435"/>
+                    </a:xfrm>
+                    <a:prstGeom prst="rect">
+                      <a:avLst/>
+                    </a:prstGeom>
+                  </pic:spPr>
+                </pic:pic>
+              </a:graphicData>
+            </a:graphic>
+          </wp:inline>
+        </w:drawing>
+      </w:r>
+    </w:p>
+    <w:p/>
     <w:sectPr>
       <w:pgSz w:w="12240" w:h="15840"/>
       <w:pgMar w:top="1417" w:right="1701" w:bottom="1417" w:left="1701" w:header="708" w:footer="708" w:gutter="0"/>

</xml_diff>